<commit_message>
chore: regenerate student word documents from updated database
</commit_message>
<xml_diff>
--- a/generated_students/Nguyễn Trương Minh Triết_N25DECE071.docx
+++ b/generated_students/Nguyễn Trương Minh Triết_N25DECE071.docx
@@ -447,6 +447,13 @@
           <w:sz w:val="26"/>
         </w:rPr>
         <w:t xml:space="preserve">Ngày sinh: </w:t>
+      </w:r>
+      <w:r>
+        <w:rPr>
+          <w:rFonts w:ascii="Times New Roman" w:hAnsi="Times New Roman"/>
+          <w:sz w:val="26"/>
+        </w:rPr>
+        <w:t>04/09/2007</w:t>
       </w:r>
     </w:p>
     <w:p>

</xml_diff>